<commit_message>
Drop submissions branch: trainees keep work in a local my-work/ folder
</commit_message>
<xml_diff>
--- a/START-HERE.docx
+++ b/START-HERE.docx
@@ -277,7 +277,7 @@
             </w:tcMar>
           </w:tcPr>
           <w:p>
-            <w:hyperlink w:history="1" r:id="rId8prtrzxcio_mew9bkxyaf">
+            <w:hyperlink w:history="1" r:id="rId0mdeukfzzh8qhfmhb9_tt">
               <w:r>
                 <w:rPr>
                   <w:rStyle w:val="Hyperlink"/>
@@ -404,7 +404,7 @@
             </w:tcMar>
           </w:tcPr>
           <w:p>
-            <w:hyperlink w:history="1" r:id="rIdadknqtruxpl9p3zn_aqzn">
+            <w:hyperlink w:history="1" r:id="rIdcmraan4nhd0lf0a3nekqp">
               <w:r>
                 <w:rPr>
                   <w:rStyle w:val="Hyperlink"/>
@@ -640,7 +640,7 @@
         </w:numPr>
         <w:spacing w:after="70"/>
       </w:pPr>
-      <w:hyperlink w:history="1" r:id="rIdzqvxgl3f4kkykp7pcbjop">
+      <w:hyperlink w:history="1" r:id="rId3ike2re2lsgjy2afvgcyq">
         <w:r>
           <w:rPr>
             <w:rStyle w:val="Hyperlink"/>
@@ -745,7 +745,7 @@
           <w:bCs/>
           <w:color w:val="2F5496"/>
         </w:rPr>
-        <w:t xml:space="preserve">Step 3 - Make your submissions branch</w:t>
+        <w:t xml:space="preserve">Step 3 - Make a folder for your work</w:t>
       </w:r>
     </w:p>
     <w:p>
@@ -753,7 +753,7 @@
         <w:spacing w:after="120"/>
       </w:pPr>
       <w:r>
-        <w:t xml:space="preserve">Your write-ups go in your own branch so everyone's work stays separate:</w:t>
+        <w:t xml:space="preserve">Keep your write-ups in a local folder. It is just for you - not part of the repo, and you do not push it anywhere:</w:t>
       </w:r>
     </w:p>
     <w:p>
@@ -770,7 +770,7 @@
           <w:sz w:val="20"/>
           <w:szCs w:val="20"/>
         </w:rPr>
-        <w:t xml:space="preserve">git checkout -b submissions/&lt;your-name&gt;</w:t>
+        <w:t xml:space="preserve">mkdir my-work</w:t>
       </w:r>
     </w:p>
     <w:p>
@@ -778,7 +778,7 @@
         <w:spacing w:after="120"/>
       </w:pPr>
       <w:r>
-        <w:t xml:space="preserve">Everything you produce goes under </w:t>
+        <w:t xml:space="preserve">Everything you produce goes in </w:t>
       </w:r>
       <w:r>
         <w:rPr>
@@ -787,10 +787,10 @@
           <w:sz w:val="20"/>
           <w:szCs w:val="20"/>
         </w:rPr>
-        <w:t xml:space="preserve">submissions/&lt;your-name&gt;/</w:t>
-      </w:r>
-      <w:r>
-        <w:t xml:space="preserve">. Commit and push it as you finish each phase.</w:t>
+        <w:t xml:space="preserve">my-work/</w:t>
+      </w:r>
+      <w:r>
+        <w:t xml:space="preserve">. When you finish a phase, send that write-up to whoever is running the course - there is nothing to commit or push back to the repo.</w:t>
       </w:r>
     </w:p>
     <w:p>
@@ -839,7 +839,7 @@
       <w:r>
         <w:t xml:space="preserve">Read the OWASP API Security Top 10 (2023): </w:t>
       </w:r>
-      <w:hyperlink w:history="1" r:id="rIdjxcs8hfuf_letntifrbya">
+      <w:hyperlink w:history="1" r:id="rId10fedtv8nkv5cvisj4ckt">
         <w:r>
           <w:rPr>
             <w:rStyle w:val="Hyperlink"/>
@@ -922,10 +922,10 @@
           <w:sz w:val="20"/>
           <w:szCs w:val="20"/>
         </w:rPr>
-        <w:t xml:space="preserve">submissions/&lt;your-name&gt;/00-orientation.md</w:t>
-      </w:r>
-      <w:r>
-        <w:t xml:space="preserve">, then commit and push.</w:t>
+        <w:t xml:space="preserve">my-work/00-orientation.md</w:t>
+      </w:r>
+      <w:r>
+        <w:t xml:space="preserve">.</w:t>
       </w:r>
     </w:p>
     <w:p>
@@ -1044,7 +1044,7 @@
           <w:sz w:val="20"/>
           <w:szCs w:val="20"/>
         </w:rPr>
-        <w:t xml:space="preserve">submissions/&lt;your-name&gt;/01-surface-map.md</w:t>
+        <w:t xml:space="preserve">my-work/01-surface-map.md</w:t>
       </w:r>
       <w:r>
         <w:t xml:space="preserve">.</w:t>
@@ -1201,7 +1201,7 @@
           <w:sz w:val="20"/>
           <w:szCs w:val="20"/>
         </w:rPr>
-        <w:t xml:space="preserve">submissions/&lt;your-name&gt;/02-crapi-findings.md</w:t>
+        <w:t xml:space="preserve">my-work/02-crapi-findings.md</w:t>
       </w:r>
       <w:r>
         <w:t xml:space="preserve">, written like a real engagement finding set.</w:t>

</xml_diff>